<commit_message>
this fixes the color contrast issue on the button and adds a metadata description to both pages
</commit_message>
<xml_diff>
--- a/wdd231_document_progressReport.docx
+++ b/wdd231_document_progressReport.docx
@@ -11,7 +11,7 @@
       <w:bookmarkEnd w:id="0"/>
       <w:r>
         <w:rPr>
-          <w:rStyle w:val="None A"/>
+          <w:rStyle w:val="None B"/>
           <w:rtl w:val="0"/>
           <w:lang w:val="en-US"/>
         </w:rPr>
@@ -19,7 +19,7 @@
       </w:r>
       <w:r>
         <w:rPr>
-          <w:rStyle w:val="None A"/>
+          <w:rStyle w:val="None B"/>
           <w:rtl w:val="0"/>
           <w:lang w:val="en-US"/>
         </w:rPr>
@@ -37,6 +37,7 @@
       </w:pPr>
       <w:r>
         <w:rPr>
+          <w:rStyle w:val="None A"/>
           <w:rtl w:val="0"/>
           <w:lang w:val="en-US"/>
         </w:rPr>
@@ -54,11 +55,13 @@
         <w:rPr>
           <w:rStyle w:val="None A"/>
           <w:rtl w:val="0"/>
+          <w:lang w:val="en-US"/>
         </w:rPr>
         <w:t>T</w:t>
       </w:r>
       <w:r>
         <w:rPr>
+          <w:rStyle w:val="None A"/>
           <w:rtl w:val="0"/>
           <w:lang w:val="en-US"/>
         </w:rPr>
@@ -127,6 +130,7 @@
       </w:pPr>
       <w:r>
         <w:rPr>
+          <w:rStyle w:val="None A"/>
           <w:rtl w:val="0"/>
           <w:lang w:val="en-US"/>
         </w:rPr>
@@ -137,7 +141,7 @@
       <w:tblPr>
         <w:tblW w:w="10800" w:type="dxa"/>
         <w:jc w:val="left"/>
-        <w:tblInd w:w="324" w:type="dxa"/>
+        <w:tblInd w:w="432" w:type="dxa"/>
         <w:tblBorders>
           <w:top w:val="single" w:color="ffffff" w:sz="8" w:space="0" w:shadow="0" w:frame="0"/>
           <w:left w:val="single" w:color="ffffff" w:sz="8" w:space="0" w:shadow="0" w:frame="0"/>
@@ -158,7 +162,7 @@
           <w:shd w:val="clear" w:color="auto" w:fill="ced7e7"/>
         </w:tblPrEx>
         <w:trPr>
-          <w:trHeight w:val="293" w:hRule="atLeast"/>
+          <w:trHeight w:val="313" w:hRule="atLeast"/>
         </w:trPr>
         <w:tc>
           <w:tcPr>
@@ -236,6 +240,14 @@
         </w:tc>
       </w:tr>
     </w:tbl>
+    <w:p>
+      <w:pPr>
+        <w:pStyle w:val="Body A"/>
+        <w:widowControl w:val="0"/>
+        <w:spacing w:before="200" w:after="200" w:line="240" w:lineRule="auto"/>
+        <w:ind w:left="324" w:hanging="324"/>
+      </w:pPr>
+    </w:p>
     <w:p>
       <w:pPr>
         <w:pStyle w:val="Body A"/>
@@ -270,11 +282,13 @@
           <w:rStyle w:val="None A"/>
           <w:rFonts w:cs="Arial Unicode MS" w:eastAsia="Arial Unicode MS"/>
           <w:rtl w:val="0"/>
+          <w:lang w:val="en-US"/>
         </w:rPr>
         <w:t>P</w:t>
       </w:r>
       <w:r>
         <w:rPr>
+          <w:rStyle w:val="None A"/>
           <w:rFonts w:cs="Arial Unicode MS" w:eastAsia="Arial Unicode MS"/>
           <w:rtl w:val="0"/>
           <w:lang w:val="en-US"/>
@@ -344,6 +358,7 @@
       </w:pPr>
       <w:r>
         <w:rPr>
+          <w:rStyle w:val="None A"/>
           <w:rtl w:val="0"/>
           <w:lang w:val="en-US"/>
         </w:rPr>
@@ -354,7 +369,7 @@
       <w:tblPr>
         <w:tblW w:w="10800" w:type="dxa"/>
         <w:jc w:val="left"/>
-        <w:tblInd w:w="324" w:type="dxa"/>
+        <w:tblInd w:w="432" w:type="dxa"/>
         <w:tblBorders>
           <w:top w:val="single" w:color="ffffff" w:sz="8" w:space="0" w:shadow="0" w:frame="0"/>
           <w:left w:val="single" w:color="ffffff" w:sz="8" w:space="0" w:shadow="0" w:frame="0"/>
@@ -375,7 +390,7 @@
           <w:shd w:val="clear" w:color="auto" w:fill="ced7e7"/>
         </w:tblPrEx>
         <w:trPr>
-          <w:trHeight w:val="2038" w:hRule="atLeast"/>
+          <w:trHeight w:val="2058" w:hRule="atLeast"/>
         </w:trPr>
         <w:tc>
           <w:tcPr>
@@ -634,7 +649,7 @@
           <w:shd w:val="clear" w:color="auto" w:fill="ced7e7"/>
         </w:tblPrEx>
         <w:trPr>
-          <w:trHeight w:val="713" w:hRule="atLeast"/>
+          <w:trHeight w:val="733" w:hRule="atLeast"/>
         </w:trPr>
         <w:tc>
           <w:tcPr>
@@ -716,7 +731,7 @@
           <w:shd w:val="clear" w:color="auto" w:fill="ced7e7"/>
         </w:tblPrEx>
         <w:trPr>
-          <w:trHeight w:val="533" w:hRule="atLeast"/>
+          <w:trHeight w:val="553" w:hRule="atLeast"/>
         </w:trPr>
         <w:tc>
           <w:tcPr>
@@ -876,6 +891,14 @@
         </w:tc>
       </w:tr>
     </w:tbl>
+    <w:p>
+      <w:pPr>
+        <w:pStyle w:val="Body A"/>
+        <w:widowControl w:val="0"/>
+        <w:spacing w:before="200" w:after="200" w:line="240" w:lineRule="auto"/>
+        <w:ind w:left="324" w:hanging="324"/>
+      </w:pPr>
+    </w:p>
     <w:p>
       <w:pPr>
         <w:pStyle w:val="Body A"/>
@@ -910,6 +933,7 @@
           <w:rStyle w:val="None A"/>
           <w:rFonts w:cs="Arial Unicode MS" w:eastAsia="Arial Unicode MS"/>
           <w:rtl w:val="0"/>
+          <w:lang w:val="en-US"/>
         </w:rPr>
         <w:t>P</w:t>
       </w:r>
@@ -985,7 +1009,7 @@
       </w:pPr>
       <w:r>
         <w:rPr>
-          <w:rStyle w:val="None"/>
+          <w:rStyle w:val="None A"/>
           <w:rtl w:val="0"/>
           <w:lang w:val="en-US"/>
         </w:rPr>
@@ -996,7 +1020,7 @@
       <w:tblPr>
         <w:tblW w:w="10800" w:type="dxa"/>
         <w:jc w:val="left"/>
-        <w:tblInd w:w="324" w:type="dxa"/>
+        <w:tblInd w:w="432" w:type="dxa"/>
         <w:tblBorders>
           <w:top w:val="single" w:color="ffffff" w:sz="8" w:space="0" w:shadow="0" w:frame="0"/>
           <w:left w:val="single" w:color="ffffff" w:sz="8" w:space="0" w:shadow="0" w:frame="0"/>
@@ -1017,7 +1041,7 @@
           <w:shd w:val="clear" w:color="auto" w:fill="ced7e7"/>
         </w:tblPrEx>
         <w:trPr>
-          <w:trHeight w:val="293" w:hRule="atLeast"/>
+          <w:trHeight w:val="313" w:hRule="atLeast"/>
         </w:trPr>
         <w:tc>
           <w:tcPr>
@@ -1101,7 +1125,7 @@
           <w:shd w:val="clear" w:color="auto" w:fill="ced7e7"/>
         </w:tblPrEx>
         <w:trPr>
-          <w:trHeight w:val="1013" w:hRule="atLeast"/>
+          <w:trHeight w:val="1033" w:hRule="atLeast"/>
         </w:trPr>
         <w:tc>
           <w:tcPr>
@@ -1169,7 +1193,7 @@
                 <w:rtl w:val="0"/>
                 <w:lang w:val="en-US"/>
               </w:rPr>
-              <w:t>The goal this week was to get the graphs going, ensure url params were working, and convert images to .webp so that our accessibility score would be high</w:t>
+              <w:t>The goal this week was to finish the project and we finished!</w:t>
             </w:r>
           </w:p>
         </w:tc>
@@ -1179,7 +1203,7 @@
           <w:shd w:val="clear" w:color="auto" w:fill="ced7e7"/>
         </w:tblPrEx>
         <w:trPr>
-          <w:trHeight w:val="973" w:hRule="atLeast"/>
+          <w:trHeight w:val="993" w:hRule="atLeast"/>
         </w:trPr>
         <w:tc>
           <w:tcPr>
@@ -1213,141 +1237,6 @@
                 <w:lang w:val="en-US"/>
               </w:rPr>
               <w:t>What successes did you have?</w:t>
-            </w:r>
-          </w:p>
-        </w:tc>
-        <w:tc>
-          <w:tcPr>
-            <w:tcW w:type="dxa" w:w="5400"/>
-            <w:tcBorders>
-              <w:top w:val="single" w:color="000000" w:sz="8" w:space="0" w:shadow="0" w:frame="0"/>
-              <w:left w:val="single" w:color="000000" w:sz="8" w:space="0" w:shadow="0" w:frame="0"/>
-              <w:bottom w:val="single" w:color="000000" w:sz="8" w:space="0" w:shadow="0" w:frame="0"/>
-              <w:right w:val="single" w:color="000000" w:sz="8" w:space="0" w:shadow="0" w:frame="0"/>
-            </w:tcBorders>
-            <w:shd w:val="clear" w:color="auto" w:fill="auto"/>
-            <w:tcMar>
-              <w:top w:type="dxa" w:w="80"/>
-              <w:left w:type="dxa" w:w="80"/>
-              <w:bottom w:type="dxa" w:w="80"/>
-              <w:right w:type="dxa" w:w="80"/>
-            </w:tcMar>
-            <w:vAlign w:val="top"/>
-          </w:tcPr>
-          <w:p>
-            <w:pPr>
-              <w:pStyle w:val="Body A"/>
-              <w:widowControl w:val="0"/>
-              <w:spacing w:line="240" w:lineRule="auto"/>
-              <w:rPr>
-                <w:rStyle w:val="None"/>
-                <w:shd w:val="nil" w:color="auto" w:fill="auto"/>
-                <w:lang w:val="en-US"/>
-              </w:rPr>
-            </w:pPr>
-            <w:r>
-              <w:rPr>
-                <w:rStyle w:val="None"/>
-                <w:shd w:val="nil" w:color="auto" w:fill="auto"/>
-                <w:rtl w:val="0"/>
-                <w:lang w:val="en-US"/>
-              </w:rPr>
-              <w:t>I really like the recent section and how to pops up when you hover over it</w:t>
-            </w:r>
-            <w:r>
-              <w:rPr>
-                <w:rStyle w:val="None"/>
-                <w:shd w:val="nil" w:color="auto" w:fill="auto"/>
-                <w:rtl w:val="0"/>
-                <w:lang w:val="en-US"/>
-              </w:rPr>
-              <w:t>’</w:t>
-            </w:r>
-            <w:r>
-              <w:rPr>
-                <w:rStyle w:val="None"/>
-                <w:shd w:val="nil" w:color="auto" w:fill="auto"/>
-                <w:rtl w:val="0"/>
-                <w:lang w:val="en-US"/>
-              </w:rPr>
-              <w:t>s something simple but out of everything, it</w:t>
-            </w:r>
-            <w:r>
-              <w:rPr>
-                <w:rStyle w:val="None"/>
-                <w:shd w:val="nil" w:color="auto" w:fill="auto"/>
-                <w:rtl w:val="0"/>
-                <w:lang w:val="en-US"/>
-              </w:rPr>
-              <w:t>’</w:t>
-            </w:r>
-            <w:r>
-              <w:rPr>
-                <w:rStyle w:val="None"/>
-                <w:shd w:val="nil" w:color="auto" w:fill="auto"/>
-                <w:rtl w:val="0"/>
-                <w:lang w:val="en-US"/>
-              </w:rPr>
-              <w:t>s my favorite thing I added.</w:t>
-            </w:r>
-          </w:p>
-          <w:p>
-            <w:pPr>
-              <w:pStyle w:val="Body A"/>
-              <w:widowControl w:val="0"/>
-              <w:spacing w:line="240" w:lineRule="auto"/>
-            </w:pPr>
-            <w:r>
-              <w:rPr>
-                <w:rStyle w:val="None"/>
-                <w:shd w:val="nil" w:color="auto" w:fill="auto"/>
-                <w:rtl w:val="0"/>
-                <w:lang w:val="en-US"/>
-              </w:rPr>
-              <w:t>Figured out how to use canvases, that was cool</w:t>
-            </w:r>
-          </w:p>
-        </w:tc>
-      </w:tr>
-      <w:tr>
-        <w:tblPrEx>
-          <w:shd w:val="clear" w:color="auto" w:fill="ced7e7"/>
-        </w:tblPrEx>
-        <w:trPr>
-          <w:trHeight w:val="293" w:hRule="atLeast"/>
-        </w:trPr>
-        <w:tc>
-          <w:tcPr>
-            <w:tcW w:type="dxa" w:w="5400"/>
-            <w:tcBorders>
-              <w:top w:val="single" w:color="000000" w:sz="8" w:space="0" w:shadow="0" w:frame="0"/>
-              <w:left w:val="single" w:color="000000" w:sz="8" w:space="0" w:shadow="0" w:frame="0"/>
-              <w:bottom w:val="single" w:color="000000" w:sz="8" w:space="0" w:shadow="0" w:frame="0"/>
-              <w:right w:val="single" w:color="000000" w:sz="8" w:space="0" w:shadow="0" w:frame="0"/>
-            </w:tcBorders>
-            <w:shd w:val="clear" w:color="auto" w:fill="auto"/>
-            <w:tcMar>
-              <w:top w:type="dxa" w:w="80"/>
-              <w:left w:type="dxa" w:w="80"/>
-              <w:bottom w:type="dxa" w:w="80"/>
-              <w:right w:type="dxa" w:w="80"/>
-            </w:tcMar>
-            <w:vAlign w:val="top"/>
-          </w:tcPr>
-          <w:p>
-            <w:pPr>
-              <w:pStyle w:val="Body A"/>
-              <w:widowControl w:val="0"/>
-              <w:spacing w:line="240" w:lineRule="auto"/>
-            </w:pPr>
-            <w:r>
-              <w:rPr>
-                <w:rStyle w:val="None"/>
-                <w:shd w:val="nil" w:color="auto" w:fill="auto"/>
-                <w:rtl w:val="0"/>
-                <w:lang w:val="en-US"/>
-              </w:rPr>
-              <w:t>What challenges did you experience?</w:t>
             </w:r>
           </w:p>
         </w:tc>
@@ -1377,30 +1266,11 @@
             </w:pPr>
             <w:r>
               <w:rPr>
-                <w:rStyle w:val="None"/>
-                <w:shd w:val="nil" w:color="auto" w:fill="auto"/>
-                <w:rtl w:val="0"/>
-                <w:lang w:val="en-US"/>
-              </w:rPr>
-              <w:t>We didn</w:t>
-            </w:r>
-            <w:r>
-              <w:rPr>
-                <w:rStyle w:val="None"/>
-                <w:shd w:val="nil" w:color="auto" w:fill="auto"/>
-                <w:rtl w:val="0"/>
-                <w:lang w:val="en-US"/>
-              </w:rPr>
-              <w:t>’</w:t>
-            </w:r>
-            <w:r>
-              <w:rPr>
-                <w:rStyle w:val="None"/>
-                <w:shd w:val="nil" w:color="auto" w:fill="auto"/>
-                <w:rtl w:val="0"/>
-                <w:lang w:val="en-US"/>
-              </w:rPr>
-              <w:t>t really run into any.</w:t>
+                <w:rFonts w:ascii="Arial" w:hAnsi="Arial"/>
+                <w:rtl w:val="0"/>
+                <w:lang w:val="en-US"/>
+              </w:rPr>
+              <w:t>It was a lot of fun working on this and we were able to finish everything we needed to</w:t>
             </w:r>
           </w:p>
         </w:tc>
@@ -1410,7 +1280,7 @@
           <w:shd w:val="clear" w:color="auto" w:fill="ced7e7"/>
         </w:tblPrEx>
         <w:trPr>
-          <w:trHeight w:val="533" w:hRule="atLeast"/>
+          <w:trHeight w:val="313" w:hRule="atLeast"/>
         </w:trPr>
         <w:tc>
           <w:tcPr>
@@ -1443,7 +1313,7 @@
                 <w:rtl w:val="0"/>
                 <w:lang w:val="en-US"/>
               </w:rPr>
-              <w:t>Did you meet with your team this week? When and how?</w:t>
+              <w:t>What challenges did you experience?</w:t>
             </w:r>
           </w:p>
         </w:tc>
@@ -1478,7 +1348,25 @@
                 <w:rtl w:val="0"/>
                 <w:lang w:val="en-US"/>
               </w:rPr>
-              <w:t>We met on Wednesday at 4:30, was a good chat</w:t>
+              <w:t>We didn</w:t>
+            </w:r>
+            <w:r>
+              <w:rPr>
+                <w:rStyle w:val="None"/>
+                <w:shd w:val="nil" w:color="auto" w:fill="auto"/>
+                <w:rtl w:val="0"/>
+                <w:lang w:val="en-US"/>
+              </w:rPr>
+              <w:t>’</w:t>
+            </w:r>
+            <w:r>
+              <w:rPr>
+                <w:rStyle w:val="None"/>
+                <w:shd w:val="nil" w:color="auto" w:fill="auto"/>
+                <w:rtl w:val="0"/>
+                <w:lang w:val="en-US"/>
+              </w:rPr>
+              <w:t>t really run into any.</w:t>
             </w:r>
           </w:p>
         </w:tc>
@@ -1488,7 +1376,7 @@
           <w:shd w:val="clear" w:color="auto" w:fill="ced7e7"/>
         </w:tblPrEx>
         <w:trPr>
-          <w:trHeight w:val="1953" w:hRule="atLeast"/>
+          <w:trHeight w:val="733" w:hRule="atLeast"/>
         </w:trPr>
         <w:tc>
           <w:tcPr>
@@ -1521,170 +1409,7 @@
                 <w:rtl w:val="0"/>
                 <w:lang w:val="en-US"/>
               </w:rPr>
-              <w:t>How well is your team working together?</w:t>
-            </w:r>
-          </w:p>
-        </w:tc>
-        <w:tc>
-          <w:tcPr>
-            <w:tcW w:type="dxa" w:w="5400"/>
-            <w:tcBorders>
-              <w:top w:val="single" w:color="000000" w:sz="8" w:space="0" w:shadow="0" w:frame="0"/>
-              <w:left w:val="single" w:color="000000" w:sz="8" w:space="0" w:shadow="0" w:frame="0"/>
-              <w:bottom w:val="single" w:color="000000" w:sz="8" w:space="0" w:shadow="0" w:frame="0"/>
-              <w:right w:val="single" w:color="000000" w:sz="8" w:space="0" w:shadow="0" w:frame="0"/>
-            </w:tcBorders>
-            <w:shd w:val="clear" w:color="auto" w:fill="auto"/>
-            <w:tcMar>
-              <w:top w:type="dxa" w:w="80"/>
-              <w:left w:type="dxa" w:w="80"/>
-              <w:bottom w:type="dxa" w:w="80"/>
-              <w:right w:type="dxa" w:w="80"/>
-            </w:tcMar>
-            <w:vAlign w:val="top"/>
-          </w:tcPr>
-          <w:p>
-            <w:pPr>
-              <w:pStyle w:val="Body A"/>
-              <w:widowControl w:val="0"/>
-              <w:spacing w:line="240" w:lineRule="auto"/>
-              <w:rPr>
-                <w:rStyle w:val="None"/>
-                <w:shd w:val="nil" w:color="auto" w:fill="auto"/>
-              </w:rPr>
-            </w:pPr>
-            <w:r>
-              <w:rPr>
-                <w:rStyle w:val="None"/>
-                <w:shd w:val="nil" w:color="auto" w:fill="auto"/>
-                <w:rtl w:val="0"/>
-                <w:lang w:val="en-US"/>
-              </w:rPr>
-              <w:t>Pretty good I think</w:t>
-            </w:r>
-          </w:p>
-          <w:p>
-            <w:pPr>
-              <w:pStyle w:val="Body A"/>
-              <w:widowControl w:val="0"/>
-              <w:spacing w:line="240" w:lineRule="auto"/>
-              <w:rPr>
-                <w:rStyle w:val="None"/>
-                <w:shd w:val="nil" w:color="auto" w:fill="auto"/>
-                <w:lang w:val="en-US"/>
-              </w:rPr>
-            </w:pPr>
-          </w:p>
-          <w:p>
-            <w:pPr>
-              <w:pStyle w:val="Body A"/>
-              <w:widowControl w:val="0"/>
-              <w:bidi w:val="0"/>
-              <w:spacing w:line="240" w:lineRule="auto"/>
-              <w:ind w:left="0" w:right="0" w:firstLine="0"/>
-              <w:jc w:val="left"/>
-              <w:rPr>
-                <w:rtl w:val="0"/>
-              </w:rPr>
-            </w:pPr>
-            <w:r>
-              <w:rPr>
-                <w:rStyle w:val="None"/>
-                <w:b w:val="1"/>
-                <w:bCs w:val="1"/>
-                <w:shd w:val="nil" w:color="auto" w:fill="auto"/>
-                <w:rtl w:val="0"/>
-                <w:lang w:val="en-US"/>
-              </w:rPr>
-              <w:t xml:space="preserve">Dalin </w:t>
-            </w:r>
-            <w:r>
-              <w:rPr>
-                <w:rStyle w:val="None"/>
-                <w:shd w:val="nil" w:color="auto" w:fill="auto"/>
-                <w:rtl w:val="0"/>
-                <w:lang w:val="en-US"/>
-              </w:rPr>
-              <w:t>- Josh helped encourage me to not drop out of school. I already have a degree and am applying to a job that I think I might get. It</w:t>
-            </w:r>
-            <w:r>
-              <w:rPr>
-                <w:rStyle w:val="None"/>
-                <w:shd w:val="nil" w:color="auto" w:fill="auto"/>
-                <w:rtl w:val="0"/>
-                <w:lang w:val="en-US"/>
-              </w:rPr>
-              <w:t>’</w:t>
-            </w:r>
-            <w:r>
-              <w:rPr>
-                <w:rStyle w:val="None"/>
-                <w:shd w:val="nil" w:color="auto" w:fill="auto"/>
-                <w:rtl w:val="0"/>
-                <w:lang w:val="en-US"/>
-              </w:rPr>
-              <w:t>s hard for me to see the value in getting a degree when it is not a core piece of the interview. I</w:t>
-            </w:r>
-            <w:r>
-              <w:rPr>
-                <w:rStyle w:val="None"/>
-                <w:shd w:val="nil" w:color="auto" w:fill="auto"/>
-                <w:rtl w:val="0"/>
-                <w:lang w:val="en-US"/>
-              </w:rPr>
-              <w:t>’</w:t>
-            </w:r>
-            <w:r>
-              <w:rPr>
-                <w:rStyle w:val="None"/>
-                <w:shd w:val="nil" w:color="auto" w:fill="auto"/>
-                <w:rtl w:val="0"/>
-                <w:lang w:val="en-US"/>
-              </w:rPr>
-              <w:t>ve been learning the most outside of school anyways</w:t>
-            </w:r>
-          </w:p>
-        </w:tc>
-      </w:tr>
-      <w:tr>
-        <w:tblPrEx>
-          <w:shd w:val="clear" w:color="auto" w:fill="ced7e7"/>
-        </w:tblPrEx>
-        <w:trPr>
-          <w:trHeight w:val="1413" w:hRule="atLeast"/>
-        </w:trPr>
-        <w:tc>
-          <w:tcPr>
-            <w:tcW w:type="dxa" w:w="5400"/>
-            <w:tcBorders>
-              <w:top w:val="single" w:color="000000" w:sz="8" w:space="0" w:shadow="0" w:frame="0"/>
-              <w:left w:val="single" w:color="000000" w:sz="8" w:space="0" w:shadow="0" w:frame="0"/>
-              <w:bottom w:val="single" w:color="000000" w:sz="8" w:space="0" w:shadow="0" w:frame="0"/>
-              <w:right w:val="single" w:color="000000" w:sz="8" w:space="0" w:shadow="0" w:frame="0"/>
-            </w:tcBorders>
-            <w:shd w:val="clear" w:color="auto" w:fill="auto"/>
-            <w:tcMar>
-              <w:top w:type="dxa" w:w="80"/>
-              <w:left w:type="dxa" w:w="80"/>
-              <w:bottom w:type="dxa" w:w="80"/>
-              <w:right w:type="dxa" w:w="80"/>
-            </w:tcMar>
-            <w:vAlign w:val="top"/>
-          </w:tcPr>
-          <w:p>
-            <w:pPr>
-              <w:pStyle w:val="Body A"/>
-              <w:widowControl w:val="0"/>
-              <w:spacing w:line="240" w:lineRule="auto"/>
-            </w:pPr>
-            <w:r>
-              <w:rPr>
-                <w:rStyle w:val="None"/>
-                <w:shd w:val="nil" w:color="auto" w:fill="auto"/>
-                <w:rtl w:val="0"/>
-                <w:lang w:val="en-US"/>
-              </w:rPr>
-              <w:t>What help do you need on your project?</w:t>
+              <w:t>Did you meet with your team this week? When and how?</w:t>
             </w:r>
           </w:p>
         </w:tc>
@@ -1714,11 +1439,12 @@
             </w:pPr>
             <w:r>
               <w:rPr>
-                <w:rFonts w:ascii="Arial" w:hAnsi="Arial"/>
-                <w:rtl w:val="0"/>
-                <w:lang w:val="en-US"/>
-              </w:rPr>
-              <w:t>We plan on meeting with you this week to discuss!</w:t>
+                <w:rStyle w:val="None"/>
+                <w:shd w:val="nil" w:color="auto" w:fill="auto"/>
+                <w:rtl w:val="0"/>
+                <w:lang w:val="en-US"/>
+              </w:rPr>
+              <w:t>We met on Thursday with you Bro. Pierce and were able to make the changes to the project that we needed to</w:t>
             </w:r>
           </w:p>
         </w:tc>
@@ -1728,7 +1454,7 @@
           <w:shd w:val="clear" w:color="auto" w:fill="ced7e7"/>
         </w:tblPrEx>
         <w:trPr>
-          <w:trHeight w:val="1713" w:hRule="atLeast"/>
+          <w:trHeight w:val="1973" w:hRule="atLeast"/>
         </w:trPr>
         <w:tc>
           <w:tcPr>
@@ -1761,7 +1487,7 @@
                 <w:rtl w:val="0"/>
                 <w:lang w:val="en-US"/>
               </w:rPr>
-              <w:t>What is your project goal for the coming week?</w:t>
+              <w:t>How well is your team working together?</w:t>
             </w:r>
           </w:p>
         </w:tc>
@@ -1800,7 +1526,7 @@
                 <w:rtl w:val="0"/>
                 <w:lang w:val="en-US"/>
               </w:rPr>
-              <w:t>We have the API, we have the HTML, and the CSS. I think we need to work on some of the styling to make it look more modern and then we just have a few more details to work.</w:t>
+              <w:t>Pretty good I think</w:t>
             </w:r>
           </w:p>
           <w:p>
@@ -1845,7 +1571,7 @@
                 <w:rtl w:val="0"/>
                 <w:lang w:val="en-US"/>
               </w:rPr>
-              <w:t>- I</w:t>
+              <w:t>- Josh helped encourage me to not drop out of school. I already have a degree and am applying to a job that I think I might get. It</w:t>
             </w:r>
             <w:r>
               <w:rPr>
@@ -1854,7 +1580,205 @@
                 <w:rtl w:val="0"/>
                 <w:lang w:val="en-US"/>
               </w:rPr>
-              <w:t xml:space="preserve"> think the last thing left is improving the HTML and CSS</w:t>
+              <w:t>’</w:t>
+            </w:r>
+            <w:r>
+              <w:rPr>
+                <w:rStyle w:val="None"/>
+                <w:shd w:val="nil" w:color="auto" w:fill="auto"/>
+                <w:rtl w:val="0"/>
+                <w:lang w:val="en-US"/>
+              </w:rPr>
+              <w:t>s hard for me to see the value in getting a degree when it is not a core piece of the interview. I</w:t>
+            </w:r>
+            <w:r>
+              <w:rPr>
+                <w:rStyle w:val="None"/>
+                <w:shd w:val="nil" w:color="auto" w:fill="auto"/>
+                <w:rtl w:val="0"/>
+                <w:lang w:val="en-US"/>
+              </w:rPr>
+              <w:t>’</w:t>
+            </w:r>
+            <w:r>
+              <w:rPr>
+                <w:rStyle w:val="None"/>
+                <w:shd w:val="nil" w:color="auto" w:fill="auto"/>
+                <w:rtl w:val="0"/>
+                <w:lang w:val="en-US"/>
+              </w:rPr>
+              <w:t>ve been learning the most outside of school anyways</w:t>
+            </w:r>
+          </w:p>
+        </w:tc>
+      </w:tr>
+      <w:tr>
+        <w:tblPrEx>
+          <w:shd w:val="clear" w:color="auto" w:fill="ced7e7"/>
+        </w:tblPrEx>
+        <w:trPr>
+          <w:trHeight w:val="1433" w:hRule="atLeast"/>
+        </w:trPr>
+        <w:tc>
+          <w:tcPr>
+            <w:tcW w:type="dxa" w:w="5400"/>
+            <w:tcBorders>
+              <w:top w:val="single" w:color="000000" w:sz="8" w:space="0" w:shadow="0" w:frame="0"/>
+              <w:left w:val="single" w:color="000000" w:sz="8" w:space="0" w:shadow="0" w:frame="0"/>
+              <w:bottom w:val="single" w:color="000000" w:sz="8" w:space="0" w:shadow="0" w:frame="0"/>
+              <w:right w:val="single" w:color="000000" w:sz="8" w:space="0" w:shadow="0" w:frame="0"/>
+            </w:tcBorders>
+            <w:shd w:val="clear" w:color="auto" w:fill="auto"/>
+            <w:tcMar>
+              <w:top w:type="dxa" w:w="80"/>
+              <w:left w:type="dxa" w:w="80"/>
+              <w:bottom w:type="dxa" w:w="80"/>
+              <w:right w:type="dxa" w:w="80"/>
+            </w:tcMar>
+            <w:vAlign w:val="top"/>
+          </w:tcPr>
+          <w:p>
+            <w:pPr>
+              <w:pStyle w:val="Body A"/>
+              <w:widowControl w:val="0"/>
+              <w:spacing w:line="240" w:lineRule="auto"/>
+            </w:pPr>
+            <w:r>
+              <w:rPr>
+                <w:rStyle w:val="None"/>
+                <w:shd w:val="nil" w:color="auto" w:fill="auto"/>
+                <w:rtl w:val="0"/>
+                <w:lang w:val="en-US"/>
+              </w:rPr>
+              <w:t>What help do you need on your project?</w:t>
+            </w:r>
+          </w:p>
+        </w:tc>
+        <w:tc>
+          <w:tcPr>
+            <w:tcW w:type="dxa" w:w="5400"/>
+            <w:tcBorders>
+              <w:top w:val="single" w:color="000000" w:sz="8" w:space="0" w:shadow="0" w:frame="0"/>
+              <w:left w:val="single" w:color="000000" w:sz="8" w:space="0" w:shadow="0" w:frame="0"/>
+              <w:bottom w:val="single" w:color="000000" w:sz="8" w:space="0" w:shadow="0" w:frame="0"/>
+              <w:right w:val="single" w:color="000000" w:sz="8" w:space="0" w:shadow="0" w:frame="0"/>
+            </w:tcBorders>
+            <w:shd w:val="clear" w:color="auto" w:fill="auto"/>
+            <w:tcMar>
+              <w:top w:type="dxa" w:w="80"/>
+              <w:left w:type="dxa" w:w="80"/>
+              <w:bottom w:type="dxa" w:w="80"/>
+              <w:right w:type="dxa" w:w="80"/>
+            </w:tcMar>
+            <w:vAlign w:val="top"/>
+          </w:tcPr>
+          <w:p>
+            <w:pPr>
+              <w:pStyle w:val="Body A"/>
+              <w:widowControl w:val="0"/>
+              <w:spacing w:line="240" w:lineRule="auto"/>
+            </w:pPr>
+            <w:r>
+              <w:rPr>
+                <w:rStyle w:val="None"/>
+                <w:shd w:val="nil" w:color="auto" w:fill="auto"/>
+                <w:rtl w:val="0"/>
+                <w:lang w:val="en-US"/>
+              </w:rPr>
+              <w:t>We got all the help in our consultation. Thank you!</w:t>
+            </w:r>
+          </w:p>
+        </w:tc>
+      </w:tr>
+      <w:tr>
+        <w:tblPrEx>
+          <w:shd w:val="clear" w:color="auto" w:fill="ced7e7"/>
+        </w:tblPrEx>
+        <w:trPr>
+          <w:trHeight w:val="1733" w:hRule="atLeast"/>
+        </w:trPr>
+        <w:tc>
+          <w:tcPr>
+            <w:tcW w:type="dxa" w:w="5400"/>
+            <w:tcBorders>
+              <w:top w:val="single" w:color="000000" w:sz="8" w:space="0" w:shadow="0" w:frame="0"/>
+              <w:left w:val="single" w:color="000000" w:sz="8" w:space="0" w:shadow="0" w:frame="0"/>
+              <w:bottom w:val="single" w:color="000000" w:sz="8" w:space="0" w:shadow="0" w:frame="0"/>
+              <w:right w:val="single" w:color="000000" w:sz="8" w:space="0" w:shadow="0" w:frame="0"/>
+            </w:tcBorders>
+            <w:shd w:val="clear" w:color="auto" w:fill="auto"/>
+            <w:tcMar>
+              <w:top w:type="dxa" w:w="80"/>
+              <w:left w:type="dxa" w:w="80"/>
+              <w:bottom w:type="dxa" w:w="80"/>
+              <w:right w:type="dxa" w:w="80"/>
+            </w:tcMar>
+            <w:vAlign w:val="top"/>
+          </w:tcPr>
+          <w:p>
+            <w:pPr>
+              <w:pStyle w:val="Body A"/>
+              <w:widowControl w:val="0"/>
+              <w:spacing w:line="240" w:lineRule="auto"/>
+            </w:pPr>
+            <w:r>
+              <w:rPr>
+                <w:rStyle w:val="None"/>
+                <w:shd w:val="nil" w:color="auto" w:fill="auto"/>
+                <w:rtl w:val="0"/>
+                <w:lang w:val="en-US"/>
+              </w:rPr>
+              <w:t>What is your project goal for the coming week?</w:t>
+            </w:r>
+          </w:p>
+        </w:tc>
+        <w:tc>
+          <w:tcPr>
+            <w:tcW w:type="dxa" w:w="5400"/>
+            <w:tcBorders>
+              <w:top w:val="single" w:color="000000" w:sz="8" w:space="0" w:shadow="0" w:frame="0"/>
+              <w:left w:val="single" w:color="000000" w:sz="8" w:space="0" w:shadow="0" w:frame="0"/>
+              <w:bottom w:val="single" w:color="000000" w:sz="8" w:space="0" w:shadow="0" w:frame="0"/>
+              <w:right w:val="single" w:color="000000" w:sz="8" w:space="0" w:shadow="0" w:frame="0"/>
+            </w:tcBorders>
+            <w:shd w:val="clear" w:color="auto" w:fill="auto"/>
+            <w:tcMar>
+              <w:top w:type="dxa" w:w="80"/>
+              <w:left w:type="dxa" w:w="80"/>
+              <w:bottom w:type="dxa" w:w="80"/>
+              <w:right w:type="dxa" w:w="80"/>
+            </w:tcMar>
+            <w:vAlign w:val="top"/>
+          </w:tcPr>
+          <w:p>
+            <w:pPr>
+              <w:pStyle w:val="Body A"/>
+              <w:widowControl w:val="0"/>
+              <w:spacing w:line="240" w:lineRule="auto"/>
+            </w:pPr>
+            <w:r>
+              <w:rPr>
+                <w:rFonts w:ascii="Arial" w:hAnsi="Arial"/>
+                <w:rtl w:val="0"/>
+                <w:lang w:val="en-US"/>
+              </w:rPr>
+              <w:t>Nothing since we</w:t>
+            </w:r>
+            <w:r>
+              <w:rPr>
+                <w:rFonts w:ascii="Arial" w:hAnsi="Arial" w:hint="default"/>
+                <w:rtl w:val="0"/>
+                <w:lang w:val="en-US"/>
+              </w:rPr>
+              <w:t>’</w:t>
+            </w:r>
+            <w:r>
+              <w:rPr>
+                <w:rFonts w:ascii="Arial" w:hAnsi="Arial"/>
+                <w:rtl w:val="0"/>
+                <w:lang w:val="en-US"/>
+              </w:rPr>
+              <w:t>re done, thanks again</w:t>
             </w:r>
           </w:p>
         </w:tc>
@@ -1865,7 +1789,7 @@
         <w:pStyle w:val="Body A"/>
         <w:widowControl w:val="0"/>
         <w:spacing w:before="200" w:after="200" w:line="240" w:lineRule="auto"/>
-        <w:ind w:left="216" w:hanging="216"/>
+        <w:ind w:left="324" w:hanging="324"/>
       </w:pPr>
       <w:r/>
     </w:p>
@@ -2211,6 +2135,12 @@
           <w14:srgbClr w14:val="000000"/>
         </w14:solidFill>
       </w14:textFill>
+    </w:rPr>
+  </w:style>
+  <w:style w:type="character" w:styleId="None B">
+    <w:name w:val="None B"/>
+    <w:rPr>
+      <w:lang w:val="en-US"/>
     </w:rPr>
   </w:style>
   <w:style w:type="character" w:styleId="None A">

</xml_diff>